<commit_message>
Nueva versión de la propuesta
</commit_message>
<xml_diff>
--- a/Paper/Entregable1_Registro_Tecnologia_Propuesta_Inicial.docx
+++ b/Paper/Entregable1_Registro_Tecnologia_Propuesta_Inicial.docx
@@ -34,6 +34,22 @@
           <w:lang w:val="es-CR"/>
         </w:rPr>
         <w:t>XS0131  Gestión de Bases de Datos y Análisis de Información</w:t>
+      </w:r>
+    </w:p>
+    <w:p>
+      <w:pPr>
+        <w:jc w:val="center"/>
+        <w:rPr>
+          <w:rFonts w:ascii="Times New Roman" w:hAnsi="Times New Roman" w:cs="Times New Roman"/>
+          <w:lang w:val="es-CR"/>
+        </w:rPr>
+      </w:pPr>
+      <w:r>
+        <w:rPr>
+          <w:rFonts w:ascii="Times New Roman" w:hAnsi="Times New Roman" w:cs="Times New Roman"/>
+          <w:lang w:val="es-CR"/>
+        </w:rPr>
+        <w:t>Escuela de Estadística — Grupo 8, duelo 7-8</w:t>
       </w:r>
     </w:p>
     <w:p>
@@ -221,13 +237,6 @@
           <w:rFonts w:ascii="Times New Roman" w:hAnsi="Times New Roman" w:cs="Times New Roman"/>
           <w:lang w:val="es-CR"/>
         </w:rPr>
-        <w:t>, eso es lo que nos menciona el documento del trabajo</w:t>
-      </w:r>
-      <w:r>
-        <w:rPr>
-          <w:rFonts w:ascii="Times New Roman" w:hAnsi="Times New Roman" w:cs="Times New Roman"/>
-          <w:lang w:val="es-CR"/>
-        </w:rPr>
         <w:t>.</w:t>
       </w:r>
     </w:p>
@@ -345,35 +354,7 @@
           <w:rFonts w:ascii="Times New Roman" w:hAnsi="Times New Roman" w:cs="Times New Roman"/>
           <w:lang w:val="es-CR"/>
         </w:rPr>
-        <w:t>Memgraph es una base de datos de grafos de propiedades nativa: no es una plataforma multimodelo que ofrezca grafos como una capa sobre otro modelo de almacenamiento. Toda la solución propuesta opera sobre nodos y relaciones, y la totalidad de las consultas se expresan en Cypher, sin recurrir a ningún otro paradigma de consulta. El caso FraudeLink requiere detectar patrones de conectividad</w:t>
-      </w:r>
-      <w:r>
-        <w:rPr>
-          <w:rFonts w:ascii="Times New Roman" w:hAnsi="Times New Roman" w:cs="Times New Roman"/>
-          <w:lang w:val="es-CR"/>
-        </w:rPr>
-        <w:t>, i</w:t>
-      </w:r>
-      <w:r>
-        <w:rPr>
-          <w:rFonts w:ascii="Times New Roman" w:hAnsi="Times New Roman" w:cs="Times New Roman"/>
-          <w:lang w:val="es-CR"/>
-        </w:rPr>
-        <w:t>dentidades compartidas, ciclos de transferencias, caminos entre cuentas sospechosas</w:t>
-      </w:r>
-      <w:r>
-        <w:rPr>
-          <w:rFonts w:ascii="Times New Roman" w:hAnsi="Times New Roman" w:cs="Times New Roman"/>
-          <w:lang w:val="es-CR"/>
-        </w:rPr>
-        <w:t>,</w:t>
-      </w:r>
-      <w:r>
-        <w:rPr>
-          <w:rFonts w:ascii="Times New Roman" w:hAnsi="Times New Roman" w:cs="Times New Roman"/>
-          <w:lang w:val="es-CR"/>
-        </w:rPr>
-        <w:t xml:space="preserve"> que se formulan de manera directa como patrones de grafo, lo que justifica la elección de este modelo frente a una alternativa relacional u orientada a documentos.</w:t>
+        <w:t xml:space="preserve">Memgraph es una base de datos de grafos de verdad, no una base de otro tipo que ofrece grafos como un extra. Toda la solución trabaja con nodos y relaciones, y todas las consultas se escriben en Cypher, el lenguaje de consultas de grafos. El caso FraudeLink necesita encontrar cuentas conectadas entre sí, dispositivos e IP compartidos, transferencias que forman ciclos y caminos entre cuentas sospechosas. Todo eso se expresa de forma directa como patrones en un grafo, por eso este modelo es el adecuado para el caso y no uno relacional o de documentos.</w:t>
       </w:r>
     </w:p>
     <w:p>
@@ -406,43 +387,7 @@
           <w:rFonts w:ascii="Times New Roman" w:hAnsi="Times New Roman" w:cs="Times New Roman"/>
           <w:lang w:val="es-CR"/>
         </w:rPr>
-        <w:t>La solución se compone de tres piezas: un script en Python que genera el conjunto de datos sintético</w:t>
-      </w:r>
-      <w:r>
-        <w:rPr>
-          <w:rFonts w:ascii="Times New Roman" w:hAnsi="Times New Roman" w:cs="Times New Roman"/>
-          <w:lang w:val="es-CR"/>
-        </w:rPr>
-        <w:t xml:space="preserve">, </w:t>
-      </w:r>
-      <w:r>
-        <w:rPr>
-          <w:rFonts w:ascii="Times New Roman" w:hAnsi="Times New Roman" w:cs="Times New Roman"/>
-          <w:lang w:val="es-CR"/>
-        </w:rPr>
-        <w:t>con la biblioteca Faker y una semilla fija para reproducibilidad</w:t>
-      </w:r>
-      <w:r>
-        <w:rPr>
-          <w:rFonts w:ascii="Times New Roman" w:hAnsi="Times New Roman" w:cs="Times New Roman"/>
-          <w:lang w:val="es-CR"/>
-        </w:rPr>
-        <w:t>,</w:t>
-      </w:r>
-      <w:r>
-        <w:rPr>
-          <w:rFonts w:ascii="Times New Roman" w:hAnsi="Times New Roman" w:cs="Times New Roman"/>
-          <w:lang w:val="es-CR"/>
-        </w:rPr>
-        <w:t xml:space="preserve"> y lo carga en la base mediante el protocolo Bolt, usando el driver neo4j (compatible con Memgraph); el motor Memgraph con MAGE, ejecutado como una única instancia dentro de un contenedor Docker en </w:t>
-      </w:r>
-      <w:r>
-        <w:rPr>
-          <w:rFonts w:ascii="Times New Roman" w:hAnsi="Times New Roman" w:cs="Times New Roman"/>
-          <w:lang w:val="es-CR"/>
-        </w:rPr>
-        <w:lastRenderedPageBreak/>
-        <w:t>modo IN_MEMORY_TRANSACTIONAL; y Memgraph Lab como herramienta de consulta, visualización y medición de tiempos de ejecución.</w:t>
+        <w:t xml:space="preserve">La solución tiene tres partes. Primero, un script en Python que genera los datos de prueba con la biblioteca Faker y una semilla fija (así siempre salen los mismos datos) y los carga en la base con el protocolo Bolt, usando el driver neo4j, que es compatible con Memgraph. Segundo, Memgraph con MAGE, en una sola instancia dentro de un contenedor Docker, en modo IN_MEMORY_TRANSACTIONAL (los datos se guardan en memoria). Tercero, Memgraph Lab, que sirve para hacer consultas, ver el grafo y medir cuánto tarda cada consulta.</w:t>
       </w:r>
     </w:p>
     <w:p>
@@ -458,35 +403,7 @@
           <w:rFonts w:ascii="Times New Roman" w:hAnsi="Times New Roman" w:cs="Times New Roman"/>
           <w:lang w:val="es-CR"/>
         </w:rPr>
-        <w:t>El esquema de datos propuesto consta de cinco tipos de nodo</w:t>
-      </w:r>
-      <w:r>
-        <w:rPr>
-          <w:rFonts w:ascii="Times New Roman" w:hAnsi="Times New Roman" w:cs="Times New Roman"/>
-          <w:lang w:val="es-CR"/>
-        </w:rPr>
-        <w:t xml:space="preserve">, </w:t>
-      </w:r>
-      <w:r>
-        <w:rPr>
-          <w:rFonts w:ascii="Times New Roman" w:hAnsi="Times New Roman" w:cs="Times New Roman"/>
-          <w:lang w:val="es-CR"/>
-        </w:rPr>
-        <w:t>Cliente, Cuenta, Dispositivo, IP y Comercio</w:t>
-      </w:r>
-      <w:r>
-        <w:rPr>
-          <w:rFonts w:ascii="Times New Roman" w:hAnsi="Times New Roman" w:cs="Times New Roman"/>
-          <w:lang w:val="es-CR"/>
-        </w:rPr>
-        <w:t xml:space="preserve">, </w:t>
-      </w:r>
-      <w:r>
-        <w:rPr>
-          <w:rFonts w:ascii="Times New Roman" w:hAnsi="Times New Roman" w:cs="Times New Roman"/>
-          <w:lang w:val="es-CR"/>
-        </w:rPr>
-        <w:t>y cinco relaciones dirigidas con sentido semántico claro:</w:t>
+        <w:t xml:space="preserve">El esquema de datos tiene cinco tipos de nodo (Cliente, Cuenta, Dispositivo, IP y Comercio) y cinco relaciones con dirección:</w:t>
       </w:r>
     </w:p>
     <w:p>
@@ -576,7 +493,7 @@
           <w:rFonts w:ascii="Times New Roman" w:hAnsi="Times New Roman" w:cs="Times New Roman"/>
           <w:lang w:val="es-CR"/>
         </w:rPr>
-        <w:t>Cada nodo almacena únicamente lo necesario para identificarlo (un identificador y, en Cliente y Comercio, un nombre); el monto y la fecha de cada operación se almacenan como propiedades de las relaciones TRANSFIERE_A y PAGA_EN, evitando un nodo intermedio de tipo Transferencia que duplicaría la profundidad de los recorridos de ciclos y caminos mínimos.</w:t>
+        <w:t xml:space="preserve">Cada nodo guarda solo lo necesario para identificarlo (un identificador y, en Cliente y Comercio, un nombre). El monto y la fecha de cada operación se guardan en las relaciones TRANSFIERE_A y PAGA_EN, y no en un nodo aparte de tipo Transferencia, porque ese nodo extra duplicaría el número de saltos en los recorridos de ciclos y caminos mínimos.</w:t>
       </w:r>
     </w:p>
     <w:p>
@@ -626,7 +543,7 @@
           <w:rFonts w:ascii="Times New Roman" w:hAnsi="Times New Roman" w:cs="Times New Roman"/>
           <w:lang w:val="es-CR"/>
         </w:rPr>
-        <w:t>La validación de las consultas no se basará en inspección visual de resultados plausibles, sino en contrastarlos contra una verdad de referencia conocida: el generador de datos sembrará patrones de fraude deliberados con identificadores fijos y cantidades conocidas (un dispositivo e IP compartidos por un grupo fijo de cuentas, y un número fijo de ciclos de transferencias de 3 a 5 saltos), de modo que cada consulta de detección pueda evaluarse preguntando si recupera exactamente el patrón sembrado. Se complementará con verificaciones cruzadas entre los resultados de distintos requisitos, y con la medición del tiempo de ejecución de cada consulta principal en la misma instancia, documentando el procedimiento para que sea reproducible.</w:t>
+        <w:t xml:space="preserve">Para saber si las consultas funcionan no basta con ver que los resultados parezcan razonables. Se compararán contra algo que ya conocemos: el generador de datos incluirá patrones de fraude a propósito, con identificadores fijos y cantidades conocidas (un dispositivo y una IP compartidos por un grupo fijo de cuentas, y un número fijo de ciclos de transferencias de 3 a 5 saltos). Así, cada consulta de detección se evalúa con una pregunta simple: ¿encuentra exactamente el patrón que sembramos? Además, se cruzarán resultados entre requisitos distintos y se medirá el tiempo de cada consulta principal en la misma instancia, documentando el procedimiento para que se pueda repetir.</w:t>
       </w:r>
     </w:p>
     <w:p>
@@ -664,14 +581,14 @@
           <w:b/>
           <w:lang w:val="es-CR"/>
         </w:rPr>
-        <w:t xml:space="preserve">Límite de memoria de la instancia: </w:t>
+        <w:t xml:space="preserve">Límite de memoria:</w:t>
       </w:r>
       <w:r>
         <w:rPr>
           <w:rFonts w:ascii="Times New Roman" w:hAnsi="Times New Roman" w:cs="Times New Roman"/>
           <w:lang w:val="es-CR"/>
         </w:rPr>
-        <w:t>Al ejecutarse Memgraph dentro de un contenedor Docker sobre macOS, el motor dispone solo de una fracción de la RAM del equipo físico, ya que Docker Desktop corre los contenedores dentro de una máquina virtual con memoria limitada. Se anticipa que consultas de camino de longitud variable sin acotar, o que deban materializar resultados antes de ordenarlos, puedan exceder ese límite sobre un volumen de decenas de miles de relaciones.</w:t>
+        <w:t xml:space="preserve"> Memgraph correrá en Docker sobre macOS, y Docker Desktop le da solo una parte de la memoria RAM del equipo. Algunas consultas (las de caminos de largo variable sin límite, o las que guardan todos los resultados antes de ordenarlos) podrían gastar más memoria de la disponible con decenas de miles de relaciones.</w:t>
       </w:r>
     </w:p>
     <w:p>
@@ -692,49 +609,14 @@
           <w:b/>
           <w:lang w:val="es-CR"/>
         </w:rPr>
-        <w:t xml:space="preserve">Consultas de recorrido completo del grafo: </w:t>
+        <w:t xml:space="preserve">Consultas lentas:</w:t>
       </w:r>
       <w:r>
         <w:rPr>
           <w:rFonts w:ascii="Times New Roman" w:hAnsi="Times New Roman" w:cs="Times New Roman"/>
           <w:lang w:val="es-CR"/>
         </w:rPr>
-        <w:t>Las consultas que no pueden detenerse tras encontrar un número fijo de resultados</w:t>
-      </w:r>
-      <w:r>
-        <w:rPr>
-          <w:rFonts w:ascii="Times New Roman" w:hAnsi="Times New Roman" w:cs="Times New Roman"/>
-          <w:lang w:val="es-CR"/>
-        </w:rPr>
-        <w:t xml:space="preserve">, </w:t>
-      </w:r>
-      <w:r>
-        <w:rPr>
-          <w:rFonts w:ascii="Times New Roman" w:hAnsi="Times New Roman" w:cs="Times New Roman"/>
-          <w:lang w:val="es-CR"/>
-        </w:rPr>
-        <w:t>por ejemplo, las que requieren ordenar antes de aplicar un LIMIT</w:t>
-      </w:r>
-      <w:r>
-        <w:rPr>
-          <w:rFonts w:ascii="Times New Roman" w:hAnsi="Times New Roman" w:cs="Times New Roman"/>
-          <w:lang w:val="es-CR"/>
-        </w:rPr>
-        <w:t>,</w:t>
-      </w:r>
-      <w:r>
-        <w:rPr>
-          <w:rFonts w:ascii="Times New Roman" w:hAnsi="Times New Roman" w:cs="Times New Roman"/>
-          <w:lang w:val="es-CR"/>
-        </w:rPr>
-        <w:t xml:space="preserve"> </w:t>
-      </w:r>
-      <w:r>
-        <w:rPr>
-          <w:rFonts w:ascii="Times New Roman" w:hAnsi="Times New Roman" w:cs="Times New Roman"/>
-          <w:lang w:val="es-CR"/>
-        </w:rPr>
-        <w:t>deben recorrer el conjunto completo de ciclos o relaciones, lo que representa un riesgo de tiempos de ejecución significativamente mayores que las consultas puntuales.</w:t>
+        <w:t xml:space="preserve"> Las consultas que no pueden parar al encontrar unos pocos resultados, como las que ordenan antes de aplicar un LIMIT, tienen que revisar todos los ciclos o relaciones del grafo. Por eso pueden tardar mucho más que las consultas que buscan un dato puntual.</w:t>
       </w:r>
     </w:p>
     <w:p>
@@ -755,87 +637,15 @@
           <w:b/>
           <w:lang w:val="es-CR"/>
         </w:rPr>
-        <w:t xml:space="preserve">Ambigüedad entre señal sembrada y ruido estadístico: </w:t>
+        <w:t xml:space="preserve">Confundir fraude con casualidad:</w:t>
       </w:r>
       <w:r>
         <w:rPr>
           <w:rFonts w:ascii="Times New Roman" w:hAnsi="Times New Roman" w:cs="Times New Roman"/>
           <w:lang w:val="es-CR"/>
         </w:rPr>
-        <w:t xml:space="preserve">Dado el tamaño del grafo sintético, existe el riesgo de que patrones estructurales (ciclos, grados de conexión altos) ocurran por azar con una frecuencia comparable a la de los patrones de fraude </w:t>
+        <w:t xml:space="preserve"> En un grafo de este tamaño, algunos patrones (ciclos o cuentas muy conectadas) pueden aparecer por azar con una frecuencia parecida a la de los fraudes sembrados. Por eso cada hallazgo se comparará con lo que se esperaría por azar antes de considerarlo evidencia de fraude.</w:t>
       </w:r>
-      <w:r>
-        <w:rPr>
-          <w:rFonts w:ascii="Times New Roman" w:hAnsi="Times New Roman" w:cs="Times New Roman"/>
-          <w:lang w:val="es-CR"/>
-        </w:rPr>
-        <w:lastRenderedPageBreak/>
-        <w:t>deliberadamente sembrados, lo que exige contrastar cada hallazgo contra un modelo probabilístico antes de calificarlo como evidencia de fraude.</w:t>
-      </w:r>
-    </w:p>
-    <w:p>
-      <w:pPr>
-        <w:pStyle w:val="Prrafodelista"/>
-        <w:numPr>
-          <w:ilvl w:val="0"/>
-          <w:numId w:val="10"/>
-        </w:numPr>
-        <w:rPr>
-          <w:rFonts w:ascii="Times New Roman" w:hAnsi="Times New Roman" w:cs="Times New Roman"/>
-          <w:lang w:val="es-CR"/>
-        </w:rPr>
-      </w:pPr>
-      <w:r>
-        <w:rPr>
-          <w:rFonts w:ascii="Times New Roman" w:hAnsi="Times New Roman" w:cs="Times New Roman"/>
-          <w:b/>
-          <w:lang w:val="es-CR"/>
-        </w:rPr>
-        <w:t xml:space="preserve">Modelado de relaciones con fan-out: </w:t>
-      </w:r>
-      <w:r>
-        <w:rPr>
-          <w:rFonts w:ascii="Times New Roman" w:hAnsi="Times New Roman" w:cs="Times New Roman"/>
-          <w:lang w:val="es-CR"/>
-        </w:rPr>
-        <w:t>Relaciones de muchos a muchos entre entidades (por ejemplo, Dispositivo-IP) pueden requerir condiciones adicionales en las consultas de identidad compartida para aislar el patrón de interés, más allá de un conteo simple.</w:t>
-      </w:r>
-    </w:p>
-    <w:p>
-      <w:pPr>
-        <w:pStyle w:val="Prrafodelista"/>
-        <w:numPr>
-          <w:ilvl w:val="0"/>
-          <w:numId w:val="10"/>
-        </w:numPr>
-        <w:rPr>
-          <w:rFonts w:ascii="Times New Roman" w:hAnsi="Times New Roman" w:cs="Times New Roman"/>
-          <w:lang w:val="es-CR"/>
-        </w:rPr>
-      </w:pPr>
-      <w:r>
-        <w:rPr>
-          <w:rFonts w:ascii="Times New Roman" w:hAnsi="Times New Roman" w:cs="Times New Roman"/>
-          <w:b/>
-          <w:lang w:val="es-CR"/>
-        </w:rPr>
-        <w:t xml:space="preserve">Dependencias de desarrollo heterogéneas entre integrantes: </w:t>
-      </w:r>
-      <w:r>
-        <w:rPr>
-          <w:rFonts w:ascii="Times New Roman" w:hAnsi="Times New Roman" w:cs="Times New Roman"/>
-          <w:lang w:val="es-CR"/>
-        </w:rPr>
-        <w:t>El driver de conexión a Memgraph requiere herramientas de compilación nativas (C++, OpenSSL) en algunas opciones, que no están disponibles de manera uniforme en todos los equipos del grupo; se prevé validar alternativas de conexión que no dependan de esas herramientas.</w:t>
-      </w:r>
-    </w:p>
-    <w:p>
-      <w:pPr>
-        <w:rPr>
-          <w:rFonts w:ascii="Times New Roman" w:hAnsi="Times New Roman" w:cs="Times New Roman"/>
-          <w:lang w:val="es-CR"/>
-        </w:rPr>
-      </w:pPr>
     </w:p>
     <w:p>
       <w:pPr>

</xml_diff>